<commit_message>
Environment Strategy and Production Rollout: environments, promotion of code, scripts and configuration, client data flow, cutover runbook
</commit_message>
<xml_diff>
--- a/docs/package/08_Management/BrokerVerse_OOTB_Documentation_Pack_Index.docx
+++ b/docs/package/08_Management/BrokerVerse_OOTB_Documentation_Pack_Index.docx
@@ -789,7 +789,7 @@
             </w:rPr>
             <w:fldChar w:fldCharType="separate"/>
           </w:r>
-          <w:hyperlink w:anchor="__RefHeading___Toc3466_1207226446">
+          <w:hyperlink w:anchor="__RefHeading___Toc3534_33260858">
             <w:r>
               <w:rPr>
                 <w:webHidden/>
@@ -824,7 +824,7 @@
             </w:tabs>
             <w:rPr/>
           </w:pPr>
-          <w:hyperlink w:anchor="__RefHeading___Toc3468_1207226446">
+          <w:hyperlink w:anchor="__RefHeading___Toc3536_33260858">
             <w:r>
               <w:rPr>
                 <w:webHidden/>
@@ -853,7 +853,7 @@
             </w:tabs>
             <w:rPr/>
           </w:pPr>
-          <w:hyperlink w:anchor="__RefHeading___Toc3470_1207226446">
+          <w:hyperlink w:anchor="__RefHeading___Toc3538_33260858">
             <w:r>
               <w:rPr>
                 <w:webHidden/>
@@ -875,7 +875,7 @@
             </w:tabs>
             <w:rPr/>
           </w:pPr>
-          <w:hyperlink w:anchor="__RefHeading___Toc3472_1207226446">
+          <w:hyperlink w:anchor="__RefHeading___Toc3540_33260858">
             <w:r>
               <w:rPr>
                 <w:webHidden/>
@@ -897,7 +897,7 @@
             </w:tabs>
             <w:rPr/>
           </w:pPr>
-          <w:hyperlink w:anchor="__RefHeading___Toc3474_1207226446">
+          <w:hyperlink w:anchor="__RefHeading___Toc3542_33260858">
             <w:r>
               <w:rPr>
                 <w:webHidden/>
@@ -919,7 +919,7 @@
             </w:tabs>
             <w:rPr/>
           </w:pPr>
-          <w:hyperlink w:anchor="__RefHeading___Toc3476_1207226446">
+          <w:hyperlink w:anchor="__RefHeading___Toc3544_33260858">
             <w:r>
               <w:rPr>
                 <w:webHidden/>
@@ -941,7 +941,7 @@
             </w:tabs>
             <w:rPr/>
           </w:pPr>
-          <w:hyperlink w:anchor="__RefHeading___Toc3478_1207226446">
+          <w:hyperlink w:anchor="__RefHeading___Toc3546_33260858">
             <w:r>
               <w:rPr>
                 <w:webHidden/>
@@ -963,7 +963,7 @@
             </w:tabs>
             <w:rPr/>
           </w:pPr>
-          <w:hyperlink w:anchor="__RefHeading___Toc3480_1207226446">
+          <w:hyperlink w:anchor="__RefHeading___Toc3548_33260858">
             <w:r>
               <w:rPr>
                 <w:webHidden/>
@@ -985,7 +985,7 @@
             </w:tabs>
             <w:rPr/>
           </w:pPr>
-          <w:hyperlink w:anchor="__RefHeading___Toc3482_1207226446">
+          <w:hyperlink w:anchor="__RefHeading___Toc3550_33260858">
             <w:r>
               <w:rPr>
                 <w:webHidden/>
@@ -1007,7 +1007,7 @@
             </w:tabs>
             <w:rPr/>
           </w:pPr>
-          <w:hyperlink w:anchor="__RefHeading___Toc3484_1207226446">
+          <w:hyperlink w:anchor="__RefHeading___Toc3552_33260858">
             <w:r>
               <w:rPr>
                 <w:webHidden/>
@@ -1029,7 +1029,7 @@
             </w:tabs>
             <w:rPr/>
           </w:pPr>
-          <w:hyperlink w:anchor="__RefHeading___Toc3486_1207226446">
+          <w:hyperlink w:anchor="__RefHeading___Toc3554_33260858">
             <w:r>
               <w:rPr>
                 <w:webHidden/>
@@ -1051,7 +1051,7 @@
             </w:tabs>
             <w:rPr/>
           </w:pPr>
-          <w:hyperlink w:anchor="__RefHeading___Toc3488_1207226446">
+          <w:hyperlink w:anchor="__RefHeading___Toc3556_33260858">
             <w:r>
               <w:rPr>
                 <w:webHidden/>
@@ -1073,7 +1073,7 @@
             </w:tabs>
             <w:rPr/>
           </w:pPr>
-          <w:hyperlink w:anchor="__RefHeading___Toc3490_1207226446">
+          <w:hyperlink w:anchor="__RefHeading___Toc3558_33260858">
             <w:r>
               <w:rPr>
                 <w:webHidden/>
@@ -1095,7 +1095,7 @@
             </w:tabs>
             <w:rPr/>
           </w:pPr>
-          <w:hyperlink w:anchor="__RefHeading___Toc3492_1207226446">
+          <w:hyperlink w:anchor="__RefHeading___Toc3560_33260858">
             <w:r>
               <w:rPr>
                 <w:webHidden/>
@@ -1103,7 +1103,7 @@
               </w:rPr>
               <w:t>6.8 Management (08_Management)</w:t>
               <w:tab/>
-              <w:t>10</w:t>
+              <w:t>11</w:t>
             </w:r>
           </w:hyperlink>
         </w:p>
@@ -1117,7 +1117,7 @@
             </w:tabs>
             <w:rPr/>
           </w:pPr>
-          <w:hyperlink w:anchor="__RefHeading___Toc3494_1207226446">
+          <w:hyperlink w:anchor="__RefHeading___Toc3562_33260858">
             <w:r>
               <w:rPr>
                 <w:webHidden/>
@@ -1139,7 +1139,7 @@
             </w:tabs>
             <w:rPr/>
           </w:pPr>
-          <w:hyperlink w:anchor="__RefHeading___Toc3496_1207226446">
+          <w:hyperlink w:anchor="__RefHeading___Toc3564_33260858">
             <w:r>
               <w:rPr>
                 <w:webHidden/>
@@ -1161,7 +1161,7 @@
             </w:tabs>
             <w:rPr/>
           </w:pPr>
-          <w:hyperlink w:anchor="__RefHeading___Toc3498_1207226446">
+          <w:hyperlink w:anchor="__RefHeading___Toc3566_33260858">
             <w:r>
               <w:rPr>
                 <w:webHidden/>
@@ -1209,7 +1209,7 @@
       <w:r>
         <w:br w:type="page"/>
       </w:r>
-      <w:bookmarkStart w:id="0" w:name="__RefHeading___Toc3466_1207226446"/>
+      <w:bookmarkStart w:id="0" w:name="__RefHeading___Toc3534_33260858"/>
       <w:bookmarkStart w:id="1" w:name="_Toc48319687"/>
       <w:bookmarkStart w:id="2" w:name="_Toc11824118"/>
       <w:bookmarkEnd w:id="0"/>
@@ -1852,7 +1852,7 @@
           <w:spacing w:val="0"/>
         </w:rPr>
       </w:pPr>
-      <w:bookmarkStart w:id="4" w:name="__RefHeading___Toc3468_1207226446"/>
+      <w:bookmarkStart w:id="4" w:name="__RefHeading___Toc3536_33260858"/>
       <w:bookmarkStart w:id="5" w:name="_Toc233203388"/>
       <w:bookmarkEnd w:id="4"/>
       <w:r>
@@ -3078,7 +3078,7 @@
         <w:pageBreakBefore w:val="false"/>
         <w:rPr/>
       </w:pPr>
-      <w:bookmarkStart w:id="6" w:name="__RefHeading___Toc3470_1207226446"/>
+      <w:bookmarkStart w:id="6" w:name="__RefHeading___Toc3538_33260858"/>
       <w:bookmarkEnd w:id="6"/>
       <w:r>
         <w:rPr>
@@ -3871,7 +3871,7 @@
                 <w:szCs w:val="24"/>
                 <w:lang w:val="en-US" w:eastAsia="ja-JP" w:bidi="ar-SA"/>
               </w:rPr>
-              <w:t>5</w:t>
+              <w:t>6</w:t>
             </w:r>
           </w:p>
         </w:tc>
@@ -4363,7 +4363,7 @@
       <w:r>
         <w:br w:type="page"/>
       </w:r>
-      <w:bookmarkStart w:id="7" w:name="__RefHeading___Toc3472_1207226446"/>
+      <w:bookmarkStart w:id="7" w:name="__RefHeading___Toc3540_33260858"/>
       <w:bookmarkEnd w:id="7"/>
       <w:r>
         <w:rPr>
@@ -4589,7 +4589,7 @@
                 <w:szCs w:val="24"/>
                 <w:lang w:val="en-US" w:eastAsia="ja-JP" w:bidi="ar-SA"/>
               </w:rPr>
-              <w:t>Delivery (31 entries)</w:t>
+              <w:t>Delivery (33 entries)</w:t>
             </w:r>
           </w:p>
         </w:tc>
@@ -4666,7 +4666,7 @@
                 <w:szCs w:val="24"/>
                 <w:lang w:val="en-US" w:eastAsia="ja-JP" w:bidi="ar-SA"/>
               </w:rPr>
-              <w:t>Development (10 entries)</w:t>
+              <w:t>Development (11 entries)</w:t>
             </w:r>
           </w:p>
         </w:tc>
@@ -4743,7 +4743,7 @@
                 <w:szCs w:val="24"/>
                 <w:lang w:val="en-US" w:eastAsia="ja-JP" w:bidi="ar-SA"/>
               </w:rPr>
-              <w:t>Support (21 entries)</w:t>
+              <w:t>Support (22 entries)</w:t>
             </w:r>
           </w:p>
         </w:tc>
@@ -4820,7 +4820,7 @@
                 <w:szCs w:val="24"/>
                 <w:lang w:val="en-US" w:eastAsia="ja-JP" w:bidi="ar-SA"/>
               </w:rPr>
-              <w:t>Management (38 entries)</w:t>
+              <w:t>Management (39 entries)</w:t>
             </w:r>
           </w:p>
         </w:tc>
@@ -4871,7 +4871,7 @@
       <w:r>
         <w:br w:type="page"/>
       </w:r>
-      <w:bookmarkStart w:id="8" w:name="__RefHeading___Toc3474_1207226446"/>
+      <w:bookmarkStart w:id="8" w:name="__RefHeading___Toc3542_33260858"/>
       <w:bookmarkEnd w:id="8"/>
       <w:r>
         <w:rPr>
@@ -5211,7 +5211,7 @@
                 <w:szCs w:val="24"/>
                 <w:lang w:val="en-US" w:eastAsia="ja-JP" w:bidi="ar-SA"/>
               </w:rPr>
-              <w:t>Implementation Statement of Work; Customer Responsibilities and RACI Annex; Change Request Procedure and Form; Discovery Workbook Guide; Discovery and Configuration Workbook; Data Migration and Cutover Plan; Privacy Impact Assessment and Records of Processing Templates; Implementation Approach and Plan; Implementation Plan; Fit Gap Register; RAID Log Template; Project Status Report Template; Training Plan; User Manual; Reports Book; Communication Templates and Touchpoints; Communication Touchpoints; Schedules and Batch Jobs; Test Cases; Philippine Regulatory Compliance Matrix; Architecture Infrastructure Security and Privacy; Technical Reference; API and Dependency Catalogue; Data Dictionary; OOTB Strategy and Playbook INTERNAL (INTERNAL); OOTB Documentation Pack Index</w:t>
+              <w:t>Implementation Statement of Work; Customer Responsibilities and RACI Annex; Change Request Procedure and Form; Discovery Workbook Guide; Discovery and Configuration Workbook; Data Migration and Cutover Plan; Environment Strategy and Production Rollout; Privacy Impact Assessment and Records of Processing Templates; Implementation Approach and Plan; Implementation Plan; Fit Gap Register; RAID Log Template; Project Status Report Template; Training Plan; User Manual; Reports Book; Communication Templates and Touchpoints; Communication Touchpoints; Schedules and Batch Jobs; Test Cases; Philippine Regulatory Compliance Matrix; Architecture Infrastructure Security and Privacy; Technical Reference; API and Dependency Catalogue; Data Dictionary; OOTB Strategy and Playbook INTERNAL (INTERNAL); OOTB Documentation Pack Index; Upload Templates</w:t>
             </w:r>
           </w:p>
         </w:tc>
@@ -5288,7 +5288,7 @@
                 <w:szCs w:val="24"/>
                 <w:lang w:val="en-US" w:eastAsia="ja-JP" w:bidi="ar-SA"/>
               </w:rPr>
-              <w:t>UAT and Go Live Acceptance Certificates; Hypercare Exit and Handover Certificate; Data Migration and Cutover Plan; Privacy Impact Assessment and Records of Processing Templates; RAID Log Template; Project Status Report Template; User Manual; Schedules and Batch Jobs; Test Cases; Test Summary Report; Production Support Approach and Standards; Release Notes and Roadmap; Go No Go and Management Register (INTERNAL); OOTB Strategy and Playbook INTERNAL (INTERNAL); OOTB Documentation Pack Index</w:t>
+              <w:t>UAT and Go Live Acceptance Certificates; Hypercare Exit and Handover Certificate; Data Migration and Cutover Plan; Environment Strategy and Production Rollout; Privacy Impact Assessment and Records of Processing Templates; RAID Log Template; Project Status Report Template; User Manual; Schedules and Batch Jobs; Test Cases; Test Summary Report; Production Support Approach and Standards; Release Notes and Roadmap; Go No Go and Management Register (INTERNAL); OOTB Strategy and Playbook INTERNAL (INTERNAL); OOTB Documentation Pack Index; Upload Templates</w:t>
             </w:r>
           </w:p>
         </w:tc>
@@ -5379,7 +5379,7 @@
       <w:r>
         <w:br w:type="page"/>
       </w:r>
-      <w:bookmarkStart w:id="9" w:name="__RefHeading___Toc3476_1207226446"/>
+      <w:bookmarkStart w:id="9" w:name="__RefHeading___Toc3544_33260858"/>
       <w:bookmarkEnd w:id="9"/>
       <w:r>
         <w:rPr>
@@ -5396,7 +5396,7 @@
         <w:pStyle w:val="Heading2"/>
         <w:rPr/>
       </w:pPr>
-      <w:bookmarkStart w:id="10" w:name="__RefHeading___Toc3478_1207226446"/>
+      <w:bookmarkStart w:id="10" w:name="__RefHeading___Toc3546_33260858"/>
       <w:bookmarkEnd w:id="10"/>
       <w:r>
         <w:rPr>
@@ -7637,7 +7637,7 @@
         <w:pStyle w:val="Heading2"/>
         <w:rPr/>
       </w:pPr>
-      <w:bookmarkStart w:id="11" w:name="__RefHeading___Toc3480_1207226446"/>
+      <w:bookmarkStart w:id="11" w:name="__RefHeading___Toc3548_33260858"/>
       <w:bookmarkEnd w:id="11"/>
       <w:r>
         <w:rPr>
@@ -8866,7 +8866,7 @@
         <w:pStyle w:val="Heading2"/>
         <w:rPr/>
       </w:pPr>
-      <w:bookmarkStart w:id="12" w:name="__RefHeading___Toc3482_1207226446"/>
+      <w:bookmarkStart w:id="12" w:name="__RefHeading___Toc3550_33260858"/>
       <w:bookmarkEnd w:id="12"/>
       <w:r>
         <w:rPr>
@@ -12730,7 +12730,7 @@
         <w:pStyle w:val="Heading2"/>
         <w:rPr/>
       </w:pPr>
-      <w:bookmarkStart w:id="13" w:name="__RefHeading___Toc3484_1207226446"/>
+      <w:bookmarkStart w:id="13" w:name="__RefHeading___Toc3552_33260858"/>
       <w:bookmarkEnd w:id="13"/>
       <w:r>
         <w:rPr>
@@ -12758,9 +12758,9 @@
         <w:tblLook w:val="04a0" w:noHBand="0" w:noVBand="1" w:firstColumn="1" w:lastRow="0" w:lastColumn="0" w:firstRow="1"/>
       </w:tblPr>
       <w:tblGrid>
-        <w:gridCol w:w="2874"/>
-        <w:gridCol w:w="2861"/>
-        <w:gridCol w:w="1662"/>
+        <w:gridCol w:w="2577"/>
+        <w:gridCol w:w="2554"/>
+        <w:gridCol w:w="2266"/>
         <w:gridCol w:w="1616"/>
       </w:tblGrid>
       <w:tr>
@@ -12769,7 +12769,7 @@
         </w:trPr>
         <w:tc>
           <w:tcPr>
-            <w:tcW w:w="2874" w:type="dxa"/>
+            <w:tcW w:w="2577" w:type="dxa"/>
             <w:tcBorders>
               <w:top w:val="single" w:sz="4" w:space="0" w:color="BFC7D1"/>
               <w:left w:val="single" w:sz="4" w:space="0" w:color="BFC7D1"/>
@@ -12808,7 +12808,7 @@
         </w:tc>
         <w:tc>
           <w:tcPr>
-            <w:tcW w:w="2861" w:type="dxa"/>
+            <w:tcW w:w="2554" w:type="dxa"/>
             <w:tcBorders>
               <w:top w:val="single" w:sz="4" w:space="0" w:color="BFC7D1"/>
               <w:left w:val="single" w:sz="4" w:space="0" w:color="BFC7D1"/>
@@ -12847,7 +12847,7 @@
         </w:tc>
         <w:tc>
           <w:tcPr>
-            <w:tcW w:w="1662" w:type="dxa"/>
+            <w:tcW w:w="2266" w:type="dxa"/>
             <w:tcBorders>
               <w:top w:val="single" w:sz="4" w:space="0" w:color="BFC7D1"/>
               <w:left w:val="single" w:sz="4" w:space="0" w:color="BFC7D1"/>
@@ -12928,7 +12928,7 @@
         <w:trPr/>
         <w:tc>
           <w:tcPr>
-            <w:tcW w:w="2874" w:type="dxa"/>
+            <w:tcW w:w="2577" w:type="dxa"/>
             <w:tcBorders>
               <w:top w:val="single" w:sz="4" w:space="0" w:color="BFC7D1"/>
               <w:left w:val="single" w:sz="4" w:space="0" w:color="BFC7D1"/>
@@ -12991,7 +12991,7 @@
         </w:tc>
         <w:tc>
           <w:tcPr>
-            <w:tcW w:w="2861" w:type="dxa"/>
+            <w:tcW w:w="2554" w:type="dxa"/>
             <w:tcBorders>
               <w:top w:val="single" w:sz="4" w:space="0" w:color="BFC7D1"/>
               <w:left w:val="single" w:sz="4" w:space="0" w:color="BFC7D1"/>
@@ -13028,7 +13028,7 @@
         </w:tc>
         <w:tc>
           <w:tcPr>
-            <w:tcW w:w="1662" w:type="dxa"/>
+            <w:tcW w:w="2266" w:type="dxa"/>
             <w:tcBorders>
               <w:top w:val="single" w:sz="4" w:space="0" w:color="BFC7D1"/>
               <w:left w:val="single" w:sz="4" w:space="0" w:color="BFC7D1"/>
@@ -13131,7 +13131,7 @@
         <w:trPr/>
         <w:tc>
           <w:tcPr>
-            <w:tcW w:w="2874" w:type="dxa"/>
+            <w:tcW w:w="2577" w:type="dxa"/>
             <w:tcBorders>
               <w:top w:val="single" w:sz="4" w:space="0" w:color="BFC7D1"/>
               <w:left w:val="single" w:sz="4" w:space="0" w:color="BFC7D1"/>
@@ -13194,7 +13194,7 @@
         </w:tc>
         <w:tc>
           <w:tcPr>
-            <w:tcW w:w="2861" w:type="dxa"/>
+            <w:tcW w:w="2554" w:type="dxa"/>
             <w:tcBorders>
               <w:top w:val="single" w:sz="4" w:space="0" w:color="BFC7D1"/>
               <w:left w:val="single" w:sz="4" w:space="0" w:color="BFC7D1"/>
@@ -13231,7 +13231,7 @@
         </w:tc>
         <w:tc>
           <w:tcPr>
-            <w:tcW w:w="1662" w:type="dxa"/>
+            <w:tcW w:w="2266" w:type="dxa"/>
             <w:tcBorders>
               <w:top w:val="single" w:sz="4" w:space="0" w:color="BFC7D1"/>
               <w:left w:val="single" w:sz="4" w:space="0" w:color="BFC7D1"/>
@@ -13334,7 +13334,7 @@
         <w:trPr/>
         <w:tc>
           <w:tcPr>
-            <w:tcW w:w="2874" w:type="dxa"/>
+            <w:tcW w:w="2577" w:type="dxa"/>
             <w:tcBorders>
               <w:top w:val="single" w:sz="4" w:space="0" w:color="BFC7D1"/>
               <w:left w:val="single" w:sz="4" w:space="0" w:color="BFC7D1"/>
@@ -13397,7 +13397,7 @@
         </w:tc>
         <w:tc>
           <w:tcPr>
-            <w:tcW w:w="2861" w:type="dxa"/>
+            <w:tcW w:w="2554" w:type="dxa"/>
             <w:tcBorders>
               <w:top w:val="single" w:sz="4" w:space="0" w:color="BFC7D1"/>
               <w:left w:val="single" w:sz="4" w:space="0" w:color="BFC7D1"/>
@@ -13434,7 +13434,7 @@
         </w:tc>
         <w:tc>
           <w:tcPr>
-            <w:tcW w:w="1662" w:type="dxa"/>
+            <w:tcW w:w="2266" w:type="dxa"/>
             <w:tcBorders>
               <w:top w:val="single" w:sz="4" w:space="0" w:color="BFC7D1"/>
               <w:left w:val="single" w:sz="4" w:space="0" w:color="BFC7D1"/>
@@ -13537,7 +13537,7 @@
         <w:trPr/>
         <w:tc>
           <w:tcPr>
-            <w:tcW w:w="2874" w:type="dxa"/>
+            <w:tcW w:w="2577" w:type="dxa"/>
             <w:tcBorders>
               <w:top w:val="single" w:sz="4" w:space="0" w:color="BFC7D1"/>
               <w:left w:val="single" w:sz="4" w:space="0" w:color="BFC7D1"/>
@@ -13600,7 +13600,7 @@
         </w:tc>
         <w:tc>
           <w:tcPr>
-            <w:tcW w:w="2861" w:type="dxa"/>
+            <w:tcW w:w="2554" w:type="dxa"/>
             <w:tcBorders>
               <w:top w:val="single" w:sz="4" w:space="0" w:color="BFC7D1"/>
               <w:left w:val="single" w:sz="4" w:space="0" w:color="BFC7D1"/>
@@ -13637,7 +13637,7 @@
         </w:tc>
         <w:tc>
           <w:tcPr>
-            <w:tcW w:w="1662" w:type="dxa"/>
+            <w:tcW w:w="2266" w:type="dxa"/>
             <w:tcBorders>
               <w:top w:val="single" w:sz="4" w:space="0" w:color="BFC7D1"/>
               <w:left w:val="single" w:sz="4" w:space="0" w:color="BFC7D1"/>
@@ -13740,7 +13740,7 @@
         <w:trPr/>
         <w:tc>
           <w:tcPr>
-            <w:tcW w:w="2874" w:type="dxa"/>
+            <w:tcW w:w="2577" w:type="dxa"/>
             <w:tcBorders>
               <w:top w:val="single" w:sz="4" w:space="0" w:color="BFC7D1"/>
               <w:left w:val="single" w:sz="4" w:space="0" w:color="BFC7D1"/>
@@ -13771,6 +13771,209 @@
                 <w:szCs w:val="24"/>
                 <w:lang w:val="en-US" w:eastAsia="ja-JP" w:bidi="ar-SA"/>
               </w:rPr>
+              <w:t>BrokerVerse_Environment_Strategy_and_Production_Rollout</w:t>
+            </w:r>
+          </w:p>
+          <w:p>
+            <w:pPr>
+              <w:pStyle w:val="Normal"/>
+              <w:widowControl/>
+              <w:spacing w:lineRule="auto" w:line="240" w:before="0" w:after="0"/>
+              <w:jc w:val="left"/>
+              <w:rPr>
+                <w:rFonts w:ascii="Aptos" w:hAnsi="Aptos" w:eastAsia="ＭＳ 明朝" w:cs="Arial"/>
+                <w:kern w:val="0"/>
+                <w:sz w:val="24"/>
+                <w:szCs w:val="24"/>
+                <w:lang w:val="en-US" w:eastAsia="ja-JP" w:bidi="ar-SA"/>
+              </w:rPr>
+            </w:pPr>
+            <w:r>
+              <w:rPr>
+                <w:rFonts w:eastAsia="Segoe UI" w:cs="Segoe UI" w:ascii="Segoe UI" w:hAnsi="Segoe UI"/>
+                <w:color w:val="101820"/>
+                <w:kern w:val="0"/>
+                <w:sz w:val="18"/>
+                <w:szCs w:val="24"/>
+                <w:lang w:val="en-US" w:eastAsia="ja-JP" w:bidi="ar-SA"/>
+              </w:rPr>
+              <w:t>docx, pdf</w:t>
+            </w:r>
+          </w:p>
+        </w:tc>
+        <w:tc>
+          <w:tcPr>
+            <w:tcW w:w="2554" w:type="dxa"/>
+            <w:tcBorders>
+              <w:top w:val="single" w:sz="4" w:space="0" w:color="BFC7D1"/>
+              <w:left w:val="single" w:sz="4" w:space="0" w:color="BFC7D1"/>
+              <w:bottom w:val="single" w:sz="4" w:space="0" w:color="BFC7D1"/>
+              <w:right w:val="single" w:sz="4" w:space="0" w:color="BFC7D1"/>
+            </w:tcBorders>
+          </w:tcPr>
+          <w:p>
+            <w:pPr>
+              <w:pStyle w:val="Normal"/>
+              <w:widowControl/>
+              <w:spacing w:lineRule="auto" w:line="240" w:before="0" w:after="20"/>
+              <w:jc w:val="left"/>
+              <w:rPr>
+                <w:rFonts w:ascii="Aptos" w:hAnsi="Aptos" w:eastAsia="ＭＳ 明朝" w:cs="Arial"/>
+                <w:kern w:val="0"/>
+                <w:sz w:val="24"/>
+                <w:szCs w:val="24"/>
+                <w:lang w:val="en-US" w:eastAsia="ja-JP" w:bidi="ar-SA"/>
+              </w:rPr>
+            </w:pPr>
+            <w:r>
+              <w:rPr>
+                <w:rFonts w:eastAsia="Segoe UI" w:cs="Segoe UI" w:ascii="Segoe UI" w:hAnsi="Segoe UI"/>
+                <w:color w:val="101820"/>
+                <w:kern w:val="0"/>
+                <w:sz w:val="18"/>
+                <w:szCs w:val="24"/>
+                <w:lang w:val="en-US" w:eastAsia="ja-JP" w:bidi="ar-SA"/>
+              </w:rPr>
+              <w:t>Environments, promotion of code, scripts and configuration, cutover runbook and RACI</w:t>
+            </w:r>
+          </w:p>
+        </w:tc>
+        <w:tc>
+          <w:tcPr>
+            <w:tcW w:w="2266" w:type="dxa"/>
+            <w:tcBorders>
+              <w:top w:val="single" w:sz="4" w:space="0" w:color="BFC7D1"/>
+              <w:left w:val="single" w:sz="4" w:space="0" w:color="BFC7D1"/>
+              <w:bottom w:val="single" w:sz="4" w:space="0" w:color="BFC7D1"/>
+              <w:right w:val="single" w:sz="4" w:space="0" w:color="BFC7D1"/>
+            </w:tcBorders>
+          </w:tcPr>
+          <w:p>
+            <w:pPr>
+              <w:pStyle w:val="Normal"/>
+              <w:widowControl/>
+              <w:spacing w:lineRule="auto" w:line="240" w:before="0" w:after="20"/>
+              <w:jc w:val="left"/>
+              <w:rPr>
+                <w:rFonts w:ascii="Aptos" w:hAnsi="Aptos" w:eastAsia="ＭＳ 明朝" w:cs="Arial"/>
+                <w:kern w:val="0"/>
+                <w:sz w:val="24"/>
+                <w:szCs w:val="24"/>
+                <w:lang w:val="en-US" w:eastAsia="ja-JP" w:bidi="ar-SA"/>
+              </w:rPr>
+            </w:pPr>
+            <w:r>
+              <w:rPr>
+                <w:rFonts w:eastAsia="Segoe UI" w:cs="Segoe UI" w:ascii="Segoe UI" w:hAnsi="Segoe UI"/>
+                <w:color w:val="101820"/>
+                <w:kern w:val="0"/>
+                <w:sz w:val="18"/>
+                <w:szCs w:val="24"/>
+                <w:lang w:val="en-US" w:eastAsia="ja-JP" w:bidi="ar-SA"/>
+              </w:rPr>
+              <w:t>Delivery, Development, Support, Management</w:t>
+            </w:r>
+          </w:p>
+          <w:p>
+            <w:pPr>
+              <w:pStyle w:val="Normal"/>
+              <w:widowControl/>
+              <w:spacing w:lineRule="auto" w:line="240" w:before="0" w:after="0"/>
+              <w:jc w:val="left"/>
+              <w:rPr>
+                <w:rFonts w:ascii="Aptos" w:hAnsi="Aptos" w:eastAsia="ＭＳ 明朝" w:cs="Arial"/>
+                <w:kern w:val="0"/>
+                <w:sz w:val="24"/>
+                <w:szCs w:val="24"/>
+                <w:lang w:val="en-US" w:eastAsia="ja-JP" w:bidi="ar-SA"/>
+              </w:rPr>
+            </w:pPr>
+            <w:r>
+              <w:rPr>
+                <w:rFonts w:eastAsia="Segoe UI" w:cs="Segoe UI" w:ascii="Segoe UI" w:hAnsi="Segoe UI"/>
+                <w:color w:val="101820"/>
+                <w:kern w:val="0"/>
+                <w:sz w:val="18"/>
+                <w:szCs w:val="24"/>
+                <w:lang w:val="en-US" w:eastAsia="ja-JP" w:bidi="ar-SA"/>
+              </w:rPr>
+              <w:t>Client-facing</w:t>
+            </w:r>
+          </w:p>
+        </w:tc>
+        <w:tc>
+          <w:tcPr>
+            <w:tcW w:w="1616" w:type="dxa"/>
+            <w:tcBorders>
+              <w:top w:val="single" w:sz="4" w:space="0" w:color="BFC7D1"/>
+              <w:left w:val="single" w:sz="4" w:space="0" w:color="BFC7D1"/>
+              <w:bottom w:val="single" w:sz="4" w:space="0" w:color="BFC7D1"/>
+              <w:right w:val="single" w:sz="4" w:space="0" w:color="BFC7D1"/>
+            </w:tcBorders>
+          </w:tcPr>
+          <w:p>
+            <w:pPr>
+              <w:pStyle w:val="Normal"/>
+              <w:widowControl/>
+              <w:spacing w:lineRule="auto" w:line="240" w:before="0" w:after="20"/>
+              <w:jc w:val="left"/>
+              <w:rPr>
+                <w:rFonts w:ascii="Aptos" w:hAnsi="Aptos" w:eastAsia="ＭＳ 明朝" w:cs="Arial"/>
+                <w:kern w:val="0"/>
+                <w:sz w:val="24"/>
+                <w:szCs w:val="24"/>
+                <w:lang w:val="en-US" w:eastAsia="ja-JP" w:bidi="ar-SA"/>
+              </w:rPr>
+            </w:pPr>
+            <w:r>
+              <w:rPr>
+                <w:rFonts w:eastAsia="Segoe UI" w:cs="Segoe UI" w:ascii="Segoe UI" w:hAnsi="Segoe UI"/>
+                <w:color w:val="101820"/>
+                <w:kern w:val="0"/>
+                <w:sz w:val="18"/>
+                <w:szCs w:val="24"/>
+                <w:lang w:val="en-US" w:eastAsia="ja-JP" w:bidi="ar-SA"/>
+              </w:rPr>
+              <w:t>Implementation, Go-live</w:t>
+            </w:r>
+          </w:p>
+        </w:tc>
+      </w:tr>
+      <w:tr>
+        <w:trPr/>
+        <w:tc>
+          <w:tcPr>
+            <w:tcW w:w="2577" w:type="dxa"/>
+            <w:tcBorders>
+              <w:top w:val="single" w:sz="4" w:space="0" w:color="BFC7D1"/>
+              <w:left w:val="single" w:sz="4" w:space="0" w:color="BFC7D1"/>
+              <w:bottom w:val="single" w:sz="4" w:space="0" w:color="BFC7D1"/>
+              <w:right w:val="single" w:sz="4" w:space="0" w:color="BFC7D1"/>
+            </w:tcBorders>
+          </w:tcPr>
+          <w:p>
+            <w:pPr>
+              <w:pStyle w:val="Normal"/>
+              <w:widowControl/>
+              <w:spacing w:lineRule="auto" w:line="240" w:before="0" w:after="20"/>
+              <w:jc w:val="left"/>
+              <w:rPr>
+                <w:rFonts w:ascii="Aptos" w:hAnsi="Aptos" w:eastAsia="ＭＳ 明朝" w:cs="Arial"/>
+                <w:kern w:val="0"/>
+                <w:sz w:val="24"/>
+                <w:szCs w:val="24"/>
+                <w:lang w:val="en-US" w:eastAsia="ja-JP" w:bidi="ar-SA"/>
+              </w:rPr>
+            </w:pPr>
+            <w:r>
+              <w:rPr>
+                <w:rFonts w:eastAsia="Consolas" w:cs="Consolas" w:ascii="Consolas" w:hAnsi="Consolas"/>
+                <w:color w:val="101820"/>
+                <w:kern w:val="0"/>
+                <w:sz w:val="16"/>
+                <w:szCs w:val="24"/>
+                <w:lang w:val="en-US" w:eastAsia="ja-JP" w:bidi="ar-SA"/>
+              </w:rPr>
               <w:t>BrokerVerse_Privacy_Impact_Assessment_and_Records_of_Processing_Templates</w:t>
             </w:r>
           </w:p>
@@ -13803,7 +14006,7 @@
         </w:tc>
         <w:tc>
           <w:tcPr>
-            <w:tcW w:w="2861" w:type="dxa"/>
+            <w:tcW w:w="2554" w:type="dxa"/>
             <w:tcBorders>
               <w:top w:val="single" w:sz="4" w:space="0" w:color="BFC7D1"/>
               <w:left w:val="single" w:sz="4" w:space="0" w:color="BFC7D1"/>
@@ -13840,7 +14043,7 @@
         </w:tc>
         <w:tc>
           <w:tcPr>
-            <w:tcW w:w="1662" w:type="dxa"/>
+            <w:tcW w:w="2266" w:type="dxa"/>
             <w:tcBorders>
               <w:top w:val="single" w:sz="4" w:space="0" w:color="BFC7D1"/>
               <w:left w:val="single" w:sz="4" w:space="0" w:color="BFC7D1"/>
@@ -13955,7 +14158,7 @@
         <w:pStyle w:val="Heading2"/>
         <w:rPr/>
       </w:pPr>
-      <w:bookmarkStart w:id="14" w:name="__RefHeading___Toc3486_1207226446"/>
+      <w:bookmarkStart w:id="14" w:name="__RefHeading___Toc3554_33260858"/>
       <w:bookmarkEnd w:id="14"/>
       <w:r>
         <w:rPr>
@@ -16991,6 +17194,209 @@
           </w:p>
         </w:tc>
       </w:tr>
+      <w:tr>
+        <w:trPr/>
+        <w:tc>
+          <w:tcPr>
+            <w:tcW w:w="2687" w:type="dxa"/>
+            <w:tcBorders>
+              <w:top w:val="single" w:sz="4" w:space="0" w:color="BFC7D1"/>
+              <w:left w:val="single" w:sz="4" w:space="0" w:color="BFC7D1"/>
+              <w:bottom w:val="single" w:sz="4" w:space="0" w:color="BFC7D1"/>
+              <w:right w:val="single" w:sz="4" w:space="0" w:color="BFC7D1"/>
+            </w:tcBorders>
+          </w:tcPr>
+          <w:p>
+            <w:pPr>
+              <w:pStyle w:val="Normal"/>
+              <w:widowControl/>
+              <w:spacing w:lineRule="auto" w:line="240" w:before="0" w:after="20"/>
+              <w:jc w:val="left"/>
+              <w:rPr>
+                <w:rFonts w:ascii="Aptos" w:hAnsi="Aptos" w:eastAsia="ＭＳ 明朝" w:cs="Arial"/>
+                <w:kern w:val="0"/>
+                <w:sz w:val="24"/>
+                <w:szCs w:val="24"/>
+                <w:lang w:val="en-US" w:eastAsia="ja-JP" w:bidi="ar-SA"/>
+              </w:rPr>
+            </w:pPr>
+            <w:r>
+              <w:rPr>
+                <w:rFonts w:eastAsia="Consolas" w:cs="Consolas" w:ascii="Consolas" w:hAnsi="Consolas"/>
+                <w:color w:val="101820"/>
+                <w:kern w:val="0"/>
+                <w:sz w:val="16"/>
+                <w:szCs w:val="24"/>
+                <w:lang w:val="en-US" w:eastAsia="ja-JP" w:bidi="ar-SA"/>
+              </w:rPr>
+              <w:t>Upload_Templates/</w:t>
+            </w:r>
+          </w:p>
+          <w:p>
+            <w:pPr>
+              <w:pStyle w:val="Normal"/>
+              <w:widowControl/>
+              <w:spacing w:lineRule="auto" w:line="240" w:before="0" w:after="0"/>
+              <w:jc w:val="left"/>
+              <w:rPr>
+                <w:rFonts w:ascii="Aptos" w:hAnsi="Aptos" w:eastAsia="ＭＳ 明朝" w:cs="Arial"/>
+                <w:kern w:val="0"/>
+                <w:sz w:val="24"/>
+                <w:szCs w:val="24"/>
+                <w:lang w:val="en-US" w:eastAsia="ja-JP" w:bidi="ar-SA"/>
+              </w:rPr>
+            </w:pPr>
+            <w:r>
+              <w:rPr>
+                <w:rFonts w:eastAsia="Segoe UI" w:cs="Segoe UI" w:ascii="Segoe UI" w:hAnsi="Segoe UI"/>
+                <w:color w:val="101820"/>
+                <w:kern w:val="0"/>
+                <w:sz w:val="18"/>
+                <w:szCs w:val="24"/>
+                <w:lang w:val="en-US" w:eastAsia="ja-JP" w:bidi="ar-SA"/>
+              </w:rPr>
+              <w:t>folder</w:t>
+            </w:r>
+          </w:p>
+        </w:tc>
+        <w:tc>
+          <w:tcPr>
+            <w:tcW w:w="2687" w:type="dxa"/>
+            <w:tcBorders>
+              <w:top w:val="single" w:sz="4" w:space="0" w:color="BFC7D1"/>
+              <w:left w:val="single" w:sz="4" w:space="0" w:color="BFC7D1"/>
+              <w:bottom w:val="single" w:sz="4" w:space="0" w:color="BFC7D1"/>
+              <w:right w:val="single" w:sz="4" w:space="0" w:color="BFC7D1"/>
+            </w:tcBorders>
+          </w:tcPr>
+          <w:p>
+            <w:pPr>
+              <w:pStyle w:val="Normal"/>
+              <w:widowControl/>
+              <w:spacing w:lineRule="auto" w:line="240" w:before="0" w:after="20"/>
+              <w:jc w:val="left"/>
+              <w:rPr>
+                <w:rFonts w:ascii="Aptos" w:hAnsi="Aptos" w:eastAsia="ＭＳ 明朝" w:cs="Arial"/>
+                <w:kern w:val="0"/>
+                <w:sz w:val="24"/>
+                <w:szCs w:val="24"/>
+                <w:lang w:val="en-US" w:eastAsia="ja-JP" w:bidi="ar-SA"/>
+              </w:rPr>
+            </w:pPr>
+            <w:r>
+              <w:rPr>
+                <w:rFonts w:eastAsia="Segoe UI" w:cs="Segoe UI" w:ascii="Segoe UI" w:hAnsi="Segoe UI"/>
+                <w:color w:val="101820"/>
+                <w:kern w:val="0"/>
+                <w:sz w:val="18"/>
+                <w:szCs w:val="24"/>
+                <w:lang w:val="en-US" w:eastAsia="ja-JP" w:bidi="ar-SA"/>
+              </w:rPr>
+              <w:t>Standard upload templates for the go-live data, one per master or opening balance</w:t>
+            </w:r>
+          </w:p>
+        </w:tc>
+        <w:tc>
+          <w:tcPr>
+            <w:tcW w:w="1848" w:type="dxa"/>
+            <w:tcBorders>
+              <w:top w:val="single" w:sz="4" w:space="0" w:color="BFC7D1"/>
+              <w:left w:val="single" w:sz="4" w:space="0" w:color="BFC7D1"/>
+              <w:bottom w:val="single" w:sz="4" w:space="0" w:color="BFC7D1"/>
+              <w:right w:val="single" w:sz="4" w:space="0" w:color="BFC7D1"/>
+            </w:tcBorders>
+          </w:tcPr>
+          <w:p>
+            <w:pPr>
+              <w:pStyle w:val="Normal"/>
+              <w:widowControl/>
+              <w:spacing w:lineRule="auto" w:line="240" w:before="0" w:after="20"/>
+              <w:jc w:val="left"/>
+              <w:rPr>
+                <w:rFonts w:ascii="Aptos" w:hAnsi="Aptos" w:eastAsia="ＭＳ 明朝" w:cs="Arial"/>
+                <w:kern w:val="0"/>
+                <w:sz w:val="24"/>
+                <w:szCs w:val="24"/>
+                <w:lang w:val="en-US" w:eastAsia="ja-JP" w:bidi="ar-SA"/>
+              </w:rPr>
+            </w:pPr>
+            <w:r>
+              <w:rPr>
+                <w:rFonts w:eastAsia="Segoe UI" w:cs="Segoe UI" w:ascii="Segoe UI" w:hAnsi="Segoe UI"/>
+                <w:color w:val="101820"/>
+                <w:kern w:val="0"/>
+                <w:sz w:val="18"/>
+                <w:szCs w:val="24"/>
+                <w:lang w:val="en-US" w:eastAsia="ja-JP" w:bidi="ar-SA"/>
+              </w:rPr>
+              <w:t>Delivery</w:t>
+            </w:r>
+          </w:p>
+          <w:p>
+            <w:pPr>
+              <w:pStyle w:val="Normal"/>
+              <w:widowControl/>
+              <w:spacing w:lineRule="auto" w:line="240" w:before="0" w:after="0"/>
+              <w:jc w:val="left"/>
+              <w:rPr>
+                <w:rFonts w:ascii="Aptos" w:hAnsi="Aptos" w:eastAsia="ＭＳ 明朝" w:cs="Arial"/>
+                <w:kern w:val="0"/>
+                <w:sz w:val="24"/>
+                <w:szCs w:val="24"/>
+                <w:lang w:val="en-US" w:eastAsia="ja-JP" w:bidi="ar-SA"/>
+              </w:rPr>
+            </w:pPr>
+            <w:r>
+              <w:rPr>
+                <w:rFonts w:eastAsia="Segoe UI" w:cs="Segoe UI" w:ascii="Segoe UI" w:hAnsi="Segoe UI"/>
+                <w:color w:val="101820"/>
+                <w:kern w:val="0"/>
+                <w:sz w:val="18"/>
+                <w:szCs w:val="24"/>
+                <w:lang w:val="en-US" w:eastAsia="ja-JP" w:bidi="ar-SA"/>
+              </w:rPr>
+              <w:t>Client-facing</w:t>
+            </w:r>
+          </w:p>
+        </w:tc>
+        <w:tc>
+          <w:tcPr>
+            <w:tcW w:w="1791" w:type="dxa"/>
+            <w:tcBorders>
+              <w:top w:val="single" w:sz="4" w:space="0" w:color="BFC7D1"/>
+              <w:left w:val="single" w:sz="4" w:space="0" w:color="BFC7D1"/>
+              <w:bottom w:val="single" w:sz="4" w:space="0" w:color="BFC7D1"/>
+              <w:right w:val="single" w:sz="4" w:space="0" w:color="BFC7D1"/>
+            </w:tcBorders>
+          </w:tcPr>
+          <w:p>
+            <w:pPr>
+              <w:pStyle w:val="Normal"/>
+              <w:widowControl/>
+              <w:spacing w:lineRule="auto" w:line="240" w:before="0" w:after="20"/>
+              <w:jc w:val="left"/>
+              <w:rPr>
+                <w:rFonts w:ascii="Aptos" w:hAnsi="Aptos" w:eastAsia="ＭＳ 明朝" w:cs="Arial"/>
+                <w:kern w:val="0"/>
+                <w:sz w:val="24"/>
+                <w:szCs w:val="24"/>
+                <w:lang w:val="en-US" w:eastAsia="ja-JP" w:bidi="ar-SA"/>
+              </w:rPr>
+            </w:pPr>
+            <w:r>
+              <w:rPr>
+                <w:rFonts w:eastAsia="Segoe UI" w:cs="Segoe UI" w:ascii="Segoe UI" w:hAnsi="Segoe UI"/>
+                <w:color w:val="101820"/>
+                <w:kern w:val="0"/>
+                <w:sz w:val="18"/>
+                <w:szCs w:val="24"/>
+                <w:lang w:val="en-US" w:eastAsia="ja-JP" w:bidi="ar-SA"/>
+              </w:rPr>
+              <w:t>Implementation, Go-live</w:t>
+            </w:r>
+          </w:p>
+        </w:tc>
+      </w:tr>
     </w:tbl>
     <w:p>
       <w:pPr>
@@ -17007,7 +17413,7 @@
         <w:pStyle w:val="Heading2"/>
         <w:rPr/>
       </w:pPr>
-      <w:bookmarkStart w:id="15" w:name="__RefHeading___Toc3488_1207226446"/>
+      <w:bookmarkStart w:id="15" w:name="__RefHeading___Toc3556_33260858"/>
       <w:bookmarkEnd w:id="15"/>
       <w:r>
         <w:rPr>
@@ -18029,7 +18435,7 @@
         <w:pStyle w:val="Heading2"/>
         <w:rPr/>
       </w:pPr>
-      <w:bookmarkStart w:id="16" w:name="__RefHeading___Toc3490_1207226446"/>
+      <w:bookmarkStart w:id="16" w:name="__RefHeading___Toc3558_33260858"/>
       <w:bookmarkEnd w:id="16"/>
       <w:r>
         <w:rPr>
@@ -19051,7 +19457,7 @@
         <w:pStyle w:val="Heading2"/>
         <w:rPr/>
       </w:pPr>
-      <w:bookmarkStart w:id="17" w:name="__RefHeading___Toc3492_1207226446"/>
+      <w:bookmarkStart w:id="17" w:name="__RefHeading___Toc3560_33260858"/>
       <w:bookmarkEnd w:id="17"/>
       <w:r>
         <w:rPr>
@@ -19865,7 +20271,7 @@
       <w:r>
         <w:br w:type="page"/>
       </w:r>
-      <w:bookmarkStart w:id="18" w:name="__RefHeading___Toc3494_1207226446"/>
+      <w:bookmarkStart w:id="18" w:name="__RefHeading___Toc3562_33260858"/>
       <w:bookmarkEnd w:id="18"/>
       <w:r>
         <w:rPr>
@@ -20089,7 +20495,7 @@
         <w:pStyle w:val="Heading1"/>
         <w:rPr/>
       </w:pPr>
-      <w:bookmarkStart w:id="19" w:name="__RefHeading___Toc3496_1207226446"/>
+      <w:bookmarkStart w:id="19" w:name="__RefHeading___Toc3564_33260858"/>
       <w:bookmarkEnd w:id="19"/>
       <w:r>
         <w:rPr>
@@ -20528,7 +20934,7 @@
           <w:spacing w:val="0"/>
         </w:rPr>
       </w:pPr>
-      <w:bookmarkStart w:id="20" w:name="__RefHeading___Toc3498_1207226446"/>
+      <w:bookmarkStart w:id="20" w:name="__RefHeading___Toc3566_33260858"/>
       <w:bookmarkStart w:id="21" w:name="_Toc233203395"/>
       <w:bookmarkEnd w:id="20"/>
       <w:r>

</xml_diff>

<commit_message>
Philippine fit and ASEAN rollout assessment (in progress)
</commit_message>
<xml_diff>
--- a/docs/package/08_Management/BrokerVerse_OOTB_Documentation_Pack_Index.docx
+++ b/docs/package/08_Management/BrokerVerse_OOTB_Documentation_Pack_Index.docx
@@ -789,7 +789,7 @@
             </w:rPr>
             <w:fldChar w:fldCharType="separate"/>
           </w:r>
-          <w:hyperlink w:anchor="__RefHeading___Toc3534_1856841878">
+          <w:hyperlink w:anchor="__RefHeading___Toc3572_1961981269">
             <w:r>
               <w:rPr>
                 <w:webHidden/>
@@ -824,7 +824,7 @@
             </w:tabs>
             <w:rPr/>
           </w:pPr>
-          <w:hyperlink w:anchor="__RefHeading___Toc3536_1856841878">
+          <w:hyperlink w:anchor="__RefHeading___Toc3574_1961981269">
             <w:r>
               <w:rPr>
                 <w:webHidden/>
@@ -853,7 +853,7 @@
             </w:tabs>
             <w:rPr/>
           </w:pPr>
-          <w:hyperlink w:anchor="__RefHeading___Toc3538_1856841878">
+          <w:hyperlink w:anchor="__RefHeading___Toc3576_1961981269">
             <w:r>
               <w:rPr>
                 <w:webHidden/>
@@ -875,7 +875,7 @@
             </w:tabs>
             <w:rPr/>
           </w:pPr>
-          <w:hyperlink w:anchor="__RefHeading___Toc3540_1856841878">
+          <w:hyperlink w:anchor="__RefHeading___Toc3578_1961981269">
             <w:r>
               <w:rPr>
                 <w:webHidden/>
@@ -897,7 +897,7 @@
             </w:tabs>
             <w:rPr/>
           </w:pPr>
-          <w:hyperlink w:anchor="__RefHeading___Toc3542_1856841878">
+          <w:hyperlink w:anchor="__RefHeading___Toc3580_1961981269">
             <w:r>
               <w:rPr>
                 <w:webHidden/>
@@ -919,7 +919,7 @@
             </w:tabs>
             <w:rPr/>
           </w:pPr>
-          <w:hyperlink w:anchor="__RefHeading___Toc3544_1856841878">
+          <w:hyperlink w:anchor="__RefHeading___Toc3582_1961981269">
             <w:r>
               <w:rPr>
                 <w:webHidden/>
@@ -941,7 +941,7 @@
             </w:tabs>
             <w:rPr/>
           </w:pPr>
-          <w:hyperlink w:anchor="__RefHeading___Toc3546_1856841878">
+          <w:hyperlink w:anchor="__RefHeading___Toc3584_1961981269">
             <w:r>
               <w:rPr>
                 <w:webHidden/>
@@ -963,7 +963,7 @@
             </w:tabs>
             <w:rPr/>
           </w:pPr>
-          <w:hyperlink w:anchor="__RefHeading___Toc3548_1856841878">
+          <w:hyperlink w:anchor="__RefHeading___Toc3586_1961981269">
             <w:r>
               <w:rPr>
                 <w:webHidden/>
@@ -985,7 +985,7 @@
             </w:tabs>
             <w:rPr/>
           </w:pPr>
-          <w:hyperlink w:anchor="__RefHeading___Toc3550_1856841878">
+          <w:hyperlink w:anchor="__RefHeading___Toc3588_1961981269">
             <w:r>
               <w:rPr>
                 <w:webHidden/>
@@ -1007,7 +1007,7 @@
             </w:tabs>
             <w:rPr/>
           </w:pPr>
-          <w:hyperlink w:anchor="__RefHeading___Toc3552_1856841878">
+          <w:hyperlink w:anchor="__RefHeading___Toc3590_1961981269">
             <w:r>
               <w:rPr>
                 <w:webHidden/>
@@ -1029,7 +1029,7 @@
             </w:tabs>
             <w:rPr/>
           </w:pPr>
-          <w:hyperlink w:anchor="__RefHeading___Toc3554_1856841878">
+          <w:hyperlink w:anchor="__RefHeading___Toc3592_1961981269">
             <w:r>
               <w:rPr>
                 <w:webHidden/>
@@ -1051,7 +1051,7 @@
             </w:tabs>
             <w:rPr/>
           </w:pPr>
-          <w:hyperlink w:anchor="__RefHeading___Toc3556_1856841878">
+          <w:hyperlink w:anchor="__RefHeading___Toc3594_1961981269">
             <w:r>
               <w:rPr>
                 <w:webHidden/>
@@ -1073,7 +1073,7 @@
             </w:tabs>
             <w:rPr/>
           </w:pPr>
-          <w:hyperlink w:anchor="__RefHeading___Toc3558_1856841878">
+          <w:hyperlink w:anchor="__RefHeading___Toc3596_1961981269">
             <w:r>
               <w:rPr>
                 <w:webHidden/>
@@ -1095,7 +1095,7 @@
             </w:tabs>
             <w:rPr/>
           </w:pPr>
-          <w:hyperlink w:anchor="__RefHeading___Toc3560_1856841878">
+          <w:hyperlink w:anchor="__RefHeading___Toc3598_1961981269">
             <w:r>
               <w:rPr>
                 <w:webHidden/>
@@ -1117,7 +1117,7 @@
             </w:tabs>
             <w:rPr/>
           </w:pPr>
-          <w:hyperlink w:anchor="__RefHeading___Toc3562_1856841878">
+          <w:hyperlink w:anchor="__RefHeading___Toc3600_1961981269">
             <w:r>
               <w:rPr>
                 <w:webHidden/>
@@ -1139,7 +1139,7 @@
             </w:tabs>
             <w:rPr/>
           </w:pPr>
-          <w:hyperlink w:anchor="__RefHeading___Toc3564_1856841878">
+          <w:hyperlink w:anchor="__RefHeading___Toc3602_1961981269">
             <w:r>
               <w:rPr>
                 <w:webHidden/>
@@ -1161,7 +1161,7 @@
             </w:tabs>
             <w:rPr/>
           </w:pPr>
-          <w:hyperlink w:anchor="__RefHeading___Toc3566_1856841878">
+          <w:hyperlink w:anchor="__RefHeading___Toc3604_1961981269">
             <w:r>
               <w:rPr>
                 <w:webHidden/>
@@ -1209,7 +1209,7 @@
       <w:r>
         <w:br w:type="page"/>
       </w:r>
-      <w:bookmarkStart w:id="0" w:name="__RefHeading___Toc3534_1856841878"/>
+      <w:bookmarkStart w:id="0" w:name="__RefHeading___Toc3572_1961981269"/>
       <w:bookmarkStart w:id="1" w:name="_Toc48319687"/>
       <w:bookmarkStart w:id="2" w:name="_Toc11824118"/>
       <w:bookmarkEnd w:id="0"/>
@@ -1852,7 +1852,7 @@
           <w:spacing w:val="0"/>
         </w:rPr>
       </w:pPr>
-      <w:bookmarkStart w:id="4" w:name="__RefHeading___Toc3536_1856841878"/>
+      <w:bookmarkStart w:id="4" w:name="__RefHeading___Toc3574_1961981269"/>
       <w:bookmarkStart w:id="5" w:name="_Toc233203388"/>
       <w:bookmarkEnd w:id="4"/>
       <w:r>
@@ -3078,7 +3078,7 @@
         <w:pageBreakBefore w:val="false"/>
         <w:rPr/>
       </w:pPr>
-      <w:bookmarkStart w:id="6" w:name="__RefHeading___Toc3538_1856841878"/>
+      <w:bookmarkStart w:id="6" w:name="__RefHeading___Toc3576_1961981269"/>
       <w:bookmarkEnd w:id="6"/>
       <w:r>
         <w:rPr>
@@ -4312,7 +4312,7 @@
                 <w:szCs w:val="24"/>
                 <w:lang w:val="en-US" w:eastAsia="ja-JP" w:bidi="ar-SA"/>
               </w:rPr>
-              <w:t>Release recommendation and management register, OOTB strategy and this index.</w:t>
+              <w:t>Release recommendation and management register, OOTB strategy, Philippine fit and ASEAN rollout assessment, and this index.</w:t>
             </w:r>
           </w:p>
         </w:tc>
@@ -4349,7 +4349,7 @@
                 <w:szCs w:val="24"/>
                 <w:lang w:val="en-US" w:eastAsia="ja-JP" w:bidi="ar-SA"/>
               </w:rPr>
-              <w:t>3</w:t>
+              <w:t>4</w:t>
             </w:r>
           </w:p>
         </w:tc>
@@ -4363,7 +4363,7 @@
       <w:r>
         <w:br w:type="page"/>
       </w:r>
-      <w:bookmarkStart w:id="7" w:name="__RefHeading___Toc3540_1856841878"/>
+      <w:bookmarkStart w:id="7" w:name="__RefHeading___Toc3578_1961981269"/>
       <w:bookmarkEnd w:id="7"/>
       <w:r>
         <w:rPr>
@@ -4512,7 +4512,7 @@
                 <w:szCs w:val="24"/>
                 <w:lang w:val="en-US" w:eastAsia="ja-JP" w:bidi="ar-SA"/>
               </w:rPr>
-              <w:t>Sales (26 entries)</w:t>
+              <w:t>Sales (27 entries)</w:t>
             </w:r>
           </w:p>
         </w:tc>
@@ -4666,7 +4666,7 @@
                 <w:szCs w:val="24"/>
                 <w:lang w:val="en-US" w:eastAsia="ja-JP" w:bidi="ar-SA"/>
               </w:rPr>
-              <w:t>Development (11 entries)</w:t>
+              <w:t>Development (12 entries)</w:t>
             </w:r>
           </w:p>
         </w:tc>
@@ -4820,7 +4820,7 @@
                 <w:szCs w:val="24"/>
                 <w:lang w:val="en-US" w:eastAsia="ja-JP" w:bidi="ar-SA"/>
               </w:rPr>
-              <w:t>Management (39 entries)</w:t>
+              <w:t>Management (40 entries)</w:t>
             </w:r>
           </w:p>
         </w:tc>
@@ -4857,7 +4857,7 @@
                 <w:szCs w:val="24"/>
                 <w:lang w:val="en-US" w:eastAsia="ja-JP" w:bidi="ar-SA"/>
               </w:rPr>
-              <w:t>Go/No-Go and Management Register (INTERNAL), OOTB Strategy and Playbook (INTERNAL), Commercial Proposal Note (INTERNAL), Release Notes and Roadmap</w:t>
+              <w:t>Go/No-Go and Management Register (INTERNAL), OOTB Strategy and Playbook (INTERNAL), PH Fit and ASEAN Rollout Assessment (INTERNAL), Commercial Proposal Note (INTERNAL), Release Notes and Roadmap</w:t>
             </w:r>
           </w:p>
         </w:tc>
@@ -4871,7 +4871,7 @@
       <w:r>
         <w:br w:type="page"/>
       </w:r>
-      <w:bookmarkStart w:id="8" w:name="__RefHeading___Toc3542_1856841878"/>
+      <w:bookmarkStart w:id="8" w:name="__RefHeading___Toc3580_1961981269"/>
       <w:bookmarkEnd w:id="8"/>
       <w:r>
         <w:rPr>
@@ -5057,7 +5057,7 @@
                 <w:szCs w:val="24"/>
                 <w:lang w:val="en-US" w:eastAsia="ja-JP" w:bidi="ar-SA"/>
               </w:rPr>
-              <w:t>Brochure; One Page Brochure; Client Presentation; Product Functionality; Demo Script; FAQ and Objection Handling; Prospect Email Templates; Prospect Email Templates; ROI Calculator; Competitive Battlecard INTERNAL (INTERNAL); Commercial Proposal Rate Card; Commercials and Pricing (INTERNAL); Price Book (INTERNAL); Commercial Proposal Note (INTERNAL); Mutual Non Disclosure Agreement; Security Due Diligence Questionnaire; Implementation Approach and Plan; Test Summary Report; Philippine Regulatory Compliance Matrix; Release Notes and Roadmap; Architecture Infrastructure Security and Privacy; OOTB Strategy and Playbook INTERNAL (INTERNAL); OOTB Documentation Pack Index</w:t>
+              <w:t>Brochure; One Page Brochure; Client Presentation; Product Functionality; Demo Script; FAQ and Objection Handling; Prospect Email Templates; Prospect Email Templates; ROI Calculator; Competitive Battlecard INTERNAL (INTERNAL); Commercial Proposal Rate Card; Commercials and Pricing (INTERNAL); Price Book (INTERNAL); Commercial Proposal Note (INTERNAL); Mutual Non Disclosure Agreement; Security Due Diligence Questionnaire; Implementation Approach and Plan; Test Summary Report; Philippine Regulatory Compliance Matrix; Release Notes and Roadmap; Architecture Infrastructure Security and Privacy; OOTB Strategy and Playbook INTERNAL (INTERNAL); PH Fit and ASEAN Rollout Assessment (INTERNAL); OOTB Documentation Pack Index</w:t>
             </w:r>
           </w:p>
         </w:tc>
@@ -5365,7 +5365,7 @@
                 <w:szCs w:val="24"/>
                 <w:lang w:val="en-US" w:eastAsia="ja-JP" w:bidi="ar-SA"/>
               </w:rPr>
-              <w:t>Annual Maintenance Support and SLA; Hosting and Infrastructure Services Agreement; Service Catalogue and Rate Annex; Change Request Procedure and Form; Exit and Transition Plan; Hypercare Exit and Handover Certificate; User Manual; Reports Book; Communication Templates and Touchpoints; Communication Touchpoints; Schedules and Batch Jobs; Production Support Approach and Standards; Business Continuity and Disaster Recovery Plan; Release Notes and Roadmap; Release Notes Template; Technical Reference; API and Dependency Catalogue; Data Dictionary; OOTB Strategy and Playbook INTERNAL (INTERNAL); OOTB Documentation Pack Index</w:t>
+              <w:t>Annual Maintenance Support and SLA; Hosting and Infrastructure Services Agreement; Service Catalogue and Rate Annex; Change Request Procedure and Form; Exit and Transition Plan; Hypercare Exit and Handover Certificate; User Manual; Reports Book; Communication Templates and Touchpoints; Communication Touchpoints; Schedules and Batch Jobs; Production Support Approach and Standards; Business Continuity and Disaster Recovery Plan; Release Notes and Roadmap; Release Notes Template; Technical Reference; API and Dependency Catalogue; Data Dictionary; OOTB Strategy and Playbook INTERNAL (INTERNAL); PH Fit and ASEAN Rollout Assessment (INTERNAL); OOTB Documentation Pack Index</w:t>
             </w:r>
           </w:p>
         </w:tc>
@@ -5379,7 +5379,7 @@
       <w:r>
         <w:br w:type="page"/>
       </w:r>
-      <w:bookmarkStart w:id="9" w:name="__RefHeading___Toc3544_1856841878"/>
+      <w:bookmarkStart w:id="9" w:name="__RefHeading___Toc3582_1961981269"/>
       <w:bookmarkEnd w:id="9"/>
       <w:r>
         <w:rPr>
@@ -5396,7 +5396,7 @@
         <w:pStyle w:val="Heading2"/>
         <w:rPr/>
       </w:pPr>
-      <w:bookmarkStart w:id="10" w:name="__RefHeading___Toc3546_1856841878"/>
+      <w:bookmarkStart w:id="10" w:name="__RefHeading___Toc3584_1961981269"/>
       <w:bookmarkEnd w:id="10"/>
       <w:r>
         <w:rPr>
@@ -7637,7 +7637,7 @@
         <w:pStyle w:val="Heading2"/>
         <w:rPr/>
       </w:pPr>
-      <w:bookmarkStart w:id="11" w:name="__RefHeading___Toc3548_1856841878"/>
+      <w:bookmarkStart w:id="11" w:name="__RefHeading___Toc3586_1961981269"/>
       <w:bookmarkEnd w:id="11"/>
       <w:r>
         <w:rPr>
@@ -8866,7 +8866,7 @@
         <w:pStyle w:val="Heading2"/>
         <w:rPr/>
       </w:pPr>
-      <w:bookmarkStart w:id="12" w:name="__RefHeading___Toc3550_1856841878"/>
+      <w:bookmarkStart w:id="12" w:name="__RefHeading___Toc3588_1961981269"/>
       <w:bookmarkEnd w:id="12"/>
       <w:r>
         <w:rPr>
@@ -12730,7 +12730,7 @@
         <w:pStyle w:val="Heading2"/>
         <w:rPr/>
       </w:pPr>
-      <w:bookmarkStart w:id="13" w:name="__RefHeading___Toc3552_1856841878"/>
+      <w:bookmarkStart w:id="13" w:name="__RefHeading___Toc3590_1961981269"/>
       <w:bookmarkEnd w:id="13"/>
       <w:r>
         <w:rPr>
@@ -14158,7 +14158,7 @@
         <w:pStyle w:val="Heading2"/>
         <w:rPr/>
       </w:pPr>
-      <w:bookmarkStart w:id="14" w:name="__RefHeading___Toc3554_1856841878"/>
+      <w:bookmarkStart w:id="14" w:name="__RefHeading___Toc3592_1961981269"/>
       <w:bookmarkEnd w:id="14"/>
       <w:r>
         <w:rPr>
@@ -17413,7 +17413,7 @@
         <w:pStyle w:val="Heading2"/>
         <w:rPr/>
       </w:pPr>
-      <w:bookmarkStart w:id="15" w:name="__RefHeading___Toc3556_1856841878"/>
+      <w:bookmarkStart w:id="15" w:name="__RefHeading___Toc3594_1961981269"/>
       <w:bookmarkEnd w:id="15"/>
       <w:r>
         <w:rPr>
@@ -18435,7 +18435,7 @@
         <w:pStyle w:val="Heading2"/>
         <w:rPr/>
       </w:pPr>
-      <w:bookmarkStart w:id="16" w:name="__RefHeading___Toc3558_1856841878"/>
+      <w:bookmarkStart w:id="16" w:name="__RefHeading___Toc3596_1961981269"/>
       <w:bookmarkEnd w:id="16"/>
       <w:r>
         <w:rPr>
@@ -19457,7 +19457,7 @@
         <w:pStyle w:val="Heading2"/>
         <w:rPr/>
       </w:pPr>
-      <w:bookmarkStart w:id="17" w:name="__RefHeading___Toc3560_1856841878"/>
+      <w:bookmarkStart w:id="17" w:name="__RefHeading___Toc3598_1961981269"/>
       <w:bookmarkEnd w:id="17"/>
       <w:r>
         <w:rPr>
@@ -20094,6 +20094,210 @@
                 <w:szCs w:val="24"/>
                 <w:lang w:val="en-US" w:eastAsia="ja-JP" w:bidi="ar-SA"/>
               </w:rPr>
+              <w:t>BrokerVerse_PH_Fit_and_ASEAN_Rollout_Assessment</w:t>
+            </w:r>
+          </w:p>
+          <w:p>
+            <w:pPr>
+              <w:pStyle w:val="Normal"/>
+              <w:widowControl/>
+              <w:spacing w:lineRule="auto" w:line="240" w:before="0" w:after="0"/>
+              <w:jc w:val="left"/>
+              <w:rPr>
+                <w:rFonts w:ascii="Aptos" w:hAnsi="Aptos" w:eastAsia="ＭＳ 明朝" w:cs="Arial"/>
+                <w:kern w:val="0"/>
+                <w:sz w:val="24"/>
+                <w:szCs w:val="24"/>
+                <w:lang w:val="en-US" w:eastAsia="ja-JP" w:bidi="ar-SA"/>
+              </w:rPr>
+            </w:pPr>
+            <w:r>
+              <w:rPr>
+                <w:rFonts w:eastAsia="Segoe UI" w:cs="Segoe UI" w:ascii="Segoe UI" w:hAnsi="Segoe UI"/>
+                <w:color w:val="101820"/>
+                <w:kern w:val="0"/>
+                <w:sz w:val="18"/>
+                <w:szCs w:val="24"/>
+                <w:lang w:val="en-US" w:eastAsia="ja-JP" w:bidi="ar-SA"/>
+              </w:rPr>
+              <w:t>docx, pdf, xlsx</w:t>
+            </w:r>
+          </w:p>
+        </w:tc>
+        <w:tc>
+          <w:tcPr>
+            <w:tcW w:w="2254" w:type="dxa"/>
+            <w:tcBorders>
+              <w:top w:val="single" w:sz="4" w:space="0" w:color="BFC7D1"/>
+              <w:left w:val="single" w:sz="4" w:space="0" w:color="BFC7D1"/>
+              <w:bottom w:val="single" w:sz="4" w:space="0" w:color="BFC7D1"/>
+              <w:right w:val="single" w:sz="4" w:space="0" w:color="BFC7D1"/>
+            </w:tcBorders>
+          </w:tcPr>
+          <w:p>
+            <w:pPr>
+              <w:pStyle w:val="Normal"/>
+              <w:widowControl/>
+              <w:spacing w:lineRule="auto" w:line="240" w:before="0" w:after="20"/>
+              <w:jc w:val="left"/>
+              <w:rPr>
+                <w:rFonts w:ascii="Aptos" w:hAnsi="Aptos" w:eastAsia="ＭＳ 明朝" w:cs="Arial"/>
+                <w:kern w:val="0"/>
+                <w:sz w:val="24"/>
+                <w:szCs w:val="24"/>
+                <w:lang w:val="en-US" w:eastAsia="ja-JP" w:bidi="ar-SA"/>
+              </w:rPr>
+            </w:pPr>
+            <w:r>
+              <w:rPr>
+                <w:rFonts w:eastAsia="Segoe UI" w:cs="Segoe UI" w:ascii="Segoe UI" w:hAnsi="Segoe UI"/>
+                <w:color w:val="101820"/>
+                <w:kern w:val="0"/>
+                <w:sz w:val="18"/>
+                <w:szCs w:val="24"/>
+                <w:lang w:val="en-US" w:eastAsia="ja-JP" w:bidi="ar-SA"/>
+              </w:rPr>
+              <w:t>Philippine process fit by area with evidence, gaps ranked, and the change needed for each ASEAN country</w:t>
+            </w:r>
+          </w:p>
+        </w:tc>
+        <w:tc>
+          <w:tcPr>
+            <w:tcW w:w="2254" w:type="dxa"/>
+            <w:tcBorders>
+              <w:top w:val="single" w:sz="4" w:space="0" w:color="BFC7D1"/>
+              <w:left w:val="single" w:sz="4" w:space="0" w:color="BFC7D1"/>
+              <w:bottom w:val="single" w:sz="4" w:space="0" w:color="BFC7D1"/>
+              <w:right w:val="single" w:sz="4" w:space="0" w:color="BFC7D1"/>
+            </w:tcBorders>
+          </w:tcPr>
+          <w:p>
+            <w:pPr>
+              <w:pStyle w:val="Normal"/>
+              <w:widowControl/>
+              <w:spacing w:lineRule="auto" w:line="240" w:before="0" w:after="20"/>
+              <w:jc w:val="left"/>
+              <w:rPr>
+                <w:rFonts w:ascii="Aptos" w:hAnsi="Aptos" w:eastAsia="ＭＳ 明朝" w:cs="Arial"/>
+                <w:kern w:val="0"/>
+                <w:sz w:val="24"/>
+                <w:szCs w:val="24"/>
+                <w:lang w:val="en-US" w:eastAsia="ja-JP" w:bidi="ar-SA"/>
+              </w:rPr>
+            </w:pPr>
+            <w:r>
+              <w:rPr>
+                <w:rFonts w:eastAsia="Segoe UI" w:cs="Segoe UI" w:ascii="Segoe UI" w:hAnsi="Segoe UI"/>
+                <w:color w:val="101820"/>
+                <w:kern w:val="0"/>
+                <w:sz w:val="18"/>
+                <w:szCs w:val="24"/>
+                <w:lang w:val="en-US" w:eastAsia="ja-JP" w:bidi="ar-SA"/>
+              </w:rPr>
+              <w:t>Management, Sales, Development</w:t>
+            </w:r>
+          </w:p>
+          <w:p>
+            <w:pPr>
+              <w:pStyle w:val="Normal"/>
+              <w:widowControl/>
+              <w:spacing w:lineRule="auto" w:line="240" w:before="0" w:after="0"/>
+              <w:jc w:val="left"/>
+              <w:rPr>
+                <w:rFonts w:ascii="Aptos" w:hAnsi="Aptos" w:eastAsia="ＭＳ 明朝" w:cs="Arial"/>
+                <w:kern w:val="0"/>
+                <w:sz w:val="24"/>
+                <w:szCs w:val="24"/>
+                <w:lang w:val="en-US" w:eastAsia="ja-JP" w:bidi="ar-SA"/>
+              </w:rPr>
+            </w:pPr>
+            <w:r>
+              <w:rPr>
+                <w:rFonts w:eastAsia="Segoe UI" w:cs="Segoe UI" w:ascii="Segoe UI" w:hAnsi="Segoe UI"/>
+                <w:b/>
+                <w:color w:val="101820"/>
+                <w:kern w:val="0"/>
+                <w:sz w:val="18"/>
+                <w:szCs w:val="24"/>
+                <w:lang w:val="en-US" w:eastAsia="ja-JP" w:bidi="ar-SA"/>
+              </w:rPr>
+              <w:t>INTERNAL</w:t>
+            </w:r>
+          </w:p>
+        </w:tc>
+        <w:tc>
+          <w:tcPr>
+            <w:tcW w:w="2253" w:type="dxa"/>
+            <w:tcBorders>
+              <w:top w:val="single" w:sz="4" w:space="0" w:color="BFC7D1"/>
+              <w:left w:val="single" w:sz="4" w:space="0" w:color="BFC7D1"/>
+              <w:bottom w:val="single" w:sz="4" w:space="0" w:color="BFC7D1"/>
+              <w:right w:val="single" w:sz="4" w:space="0" w:color="BFC7D1"/>
+            </w:tcBorders>
+          </w:tcPr>
+          <w:p>
+            <w:pPr>
+              <w:pStyle w:val="Normal"/>
+              <w:widowControl/>
+              <w:spacing w:lineRule="auto" w:line="240" w:before="0" w:after="20"/>
+              <w:jc w:val="left"/>
+              <w:rPr>
+                <w:rFonts w:ascii="Aptos" w:hAnsi="Aptos" w:eastAsia="ＭＳ 明朝" w:cs="Arial"/>
+                <w:kern w:val="0"/>
+                <w:sz w:val="24"/>
+                <w:szCs w:val="24"/>
+                <w:lang w:val="en-US" w:eastAsia="ja-JP" w:bidi="ar-SA"/>
+              </w:rPr>
+            </w:pPr>
+            <w:r>
+              <w:rPr>
+                <w:rFonts w:eastAsia="Segoe UI" w:cs="Segoe UI" w:ascii="Segoe UI" w:hAnsi="Segoe UI"/>
+                <w:color w:val="101820"/>
+                <w:kern w:val="0"/>
+                <w:sz w:val="18"/>
+                <w:szCs w:val="24"/>
+                <w:lang w:val="en-US" w:eastAsia="ja-JP" w:bidi="ar-SA"/>
+              </w:rPr>
+              <w:t>Pre-sales, Support</w:t>
+            </w:r>
+          </w:p>
+        </w:tc>
+      </w:tr>
+      <w:tr>
+        <w:trPr/>
+        <w:tc>
+          <w:tcPr>
+            <w:tcW w:w="2254" w:type="dxa"/>
+            <w:tcBorders>
+              <w:top w:val="single" w:sz="4" w:space="0" w:color="BFC7D1"/>
+              <w:left w:val="single" w:sz="4" w:space="0" w:color="BFC7D1"/>
+              <w:bottom w:val="single" w:sz="4" w:space="0" w:color="BFC7D1"/>
+              <w:right w:val="single" w:sz="4" w:space="0" w:color="BFC7D1"/>
+            </w:tcBorders>
+          </w:tcPr>
+          <w:p>
+            <w:pPr>
+              <w:pStyle w:val="Normal"/>
+              <w:widowControl/>
+              <w:spacing w:lineRule="auto" w:line="240" w:before="0" w:after="20"/>
+              <w:jc w:val="left"/>
+              <w:rPr>
+                <w:rFonts w:ascii="Aptos" w:hAnsi="Aptos" w:eastAsia="ＭＳ 明朝" w:cs="Arial"/>
+                <w:kern w:val="0"/>
+                <w:sz w:val="24"/>
+                <w:szCs w:val="24"/>
+                <w:lang w:val="en-US" w:eastAsia="ja-JP" w:bidi="ar-SA"/>
+              </w:rPr>
+            </w:pPr>
+            <w:r>
+              <w:rPr>
+                <w:rFonts w:eastAsia="Consolas" w:cs="Consolas" w:ascii="Consolas" w:hAnsi="Consolas"/>
+                <w:color w:val="101820"/>
+                <w:kern w:val="0"/>
+                <w:sz w:val="16"/>
+                <w:szCs w:val="24"/>
+                <w:lang w:val="en-US" w:eastAsia="ja-JP" w:bidi="ar-SA"/>
+              </w:rPr>
               <w:t>BrokerVerse_OOTB_Documentation_Pack_Index</w:t>
             </w:r>
           </w:p>
@@ -20271,7 +20475,7 @@
       <w:r>
         <w:br w:type="page"/>
       </w:r>
-      <w:bookmarkStart w:id="18" w:name="__RefHeading___Toc3562_1856841878"/>
+      <w:bookmarkStart w:id="18" w:name="__RefHeading___Toc3600_1961981269"/>
       <w:bookmarkEnd w:id="18"/>
       <w:r>
         <w:rPr>
@@ -20486,6 +20690,33 @@
         </w:rPr>
         <w:t xml:space="preserve"> (docx, pdf): How iorta TechNXT sells, delivers, supports and evolves the OOTB product.</w:t>
       </w:r>
+    </w:p>
+    <w:p>
+      <w:pPr>
+        <w:pStyle w:val="Normal"/>
+        <w:numPr>
+          <w:ilvl w:val="0"/>
+          <w:numId w:val="1"/>
+        </w:numPr>
+        <w:spacing w:before="0" w:after="60"/>
+        <w:rPr/>
+      </w:pPr>
+      <w:r>
+        <w:rPr>
+          <w:rFonts w:eastAsia="Consolas" w:cs="Consolas" w:ascii="Consolas" w:hAnsi="Consolas"/>
+          <w:color w:val="101820"/>
+          <w:sz w:val="19"/>
+        </w:rPr>
+        <w:t>08_Management/BrokerVerse_PH_Fit_and_ASEAN_Rollout_Assessment</w:t>
+      </w:r>
+      <w:r>
+        <w:rPr>
+          <w:rFonts w:eastAsia="Segoe UI" w:cs="Segoe UI" w:ascii="Segoe UI" w:hAnsi="Segoe UI"/>
+          <w:color w:val="101820"/>
+          <w:sz w:val="21"/>
+        </w:rPr>
+        <w:t xml:space="preserve"> (docx, pdf, xlsx): Philippine process fit by area with evidence, gaps ranked, and the change needed for each ASEAN country.</w:t>
+      </w:r>
       <w:r>
         <w:br w:type="page"/>
       </w:r>
@@ -20495,7 +20726,7 @@
         <w:pStyle w:val="Heading1"/>
         <w:rPr/>
       </w:pPr>
-      <w:bookmarkStart w:id="19" w:name="__RefHeading___Toc3564_1856841878"/>
+      <w:bookmarkStart w:id="19" w:name="__RefHeading___Toc3602_1961981269"/>
       <w:bookmarkEnd w:id="19"/>
       <w:r>
         <w:rPr>
@@ -20861,7 +21092,23 @@
           <w:color w:val="101820"/>
           <w:sz w:val="21"/>
         </w:rPr>
-        <w:t xml:space="preserve"> and </w:t>
+        <w:t xml:space="preserve">, </w:t>
+      </w:r>
+      <w:r>
+        <w:rPr>
+          <w:rFonts w:eastAsia="Consolas" w:cs="Consolas" w:ascii="Consolas" w:hAnsi="Consolas"/>
+          <w:color w:val="101820"/>
+          <w:sz w:val="19"/>
+        </w:rPr>
+        <w:t>build_fit_assessment_xlsx.py</w:t>
+      </w:r>
+      <w:r>
+        <w:rPr>
+          <w:rFonts w:eastAsia="Segoe UI" w:cs="Segoe UI" w:ascii="Segoe UI" w:hAnsi="Segoe UI"/>
+          <w:color w:val="101820"/>
+          <w:sz w:val="21"/>
+        </w:rPr>
+        <w:t xml:space="preserve"> (Philippine fit and ASEAN rollout assessment) and </w:t>
       </w:r>
       <w:r>
         <w:rPr>
@@ -20934,7 +21181,7 @@
           <w:spacing w:val="0"/>
         </w:rPr>
       </w:pPr>
-      <w:bookmarkStart w:id="20" w:name="__RefHeading___Toc3566_1856841878"/>
+      <w:bookmarkStart w:id="20" w:name="__RefHeading___Toc3604_1961981269"/>
       <w:bookmarkStart w:id="21" w:name="_Toc233203395"/>
       <w:bookmarkEnd w:id="20"/>
       <w:r>

</xml_diff>